<commit_message>
HW Verified with Logic Analyzer.
</commit_message>
<xml_diff>
--- a/vivado_projects/lab_05_interface/doc/Interface.docx
+++ b/vivado_projects/lab_05_interface/doc/Interface.docx
@@ -273,19 +273,7 @@
               <w:rPr>
                 <w:rStyle w:val="Hyperlink"/>
               </w:rPr>
-              <w:t>Simu</w:t>
-            </w:r>
-            <w:r>
-              <w:rPr>
-                <w:rStyle w:val="Hyperlink"/>
-              </w:rPr>
-              <w:t>l</w:t>
-            </w:r>
-            <w:r>
-              <w:rPr>
-                <w:rStyle w:val="Hyperlink"/>
-              </w:rPr>
-              <w:t>ation results</w:t>
+              <w:t>Simulation results</w:t>
             </w:r>
             <w:r>
               <w:rPr>
@@ -1273,6 +1261,9 @@
         <w:pStyle w:val="Body"/>
       </w:pPr>
       <w:r>
+        <w:rPr>
+          <w:noProof/>
+        </w:rPr>
         <w:drawing>
           <wp:inline distT="0" distB="0" distL="0" distR="0" wp14:anchorId="6F4189DF" wp14:editId="23071455">
             <wp:extent cx="5731510" cy="2563495"/>
@@ -1320,6 +1311,9 @@
         <w:pStyle w:val="Body"/>
       </w:pPr>
       <w:r>
+        <w:rPr>
+          <w:noProof/>
+        </w:rPr>
         <w:drawing>
           <wp:inline distT="0" distB="0" distL="0" distR="0" wp14:anchorId="2F3FC657" wp14:editId="010587C1">
             <wp:extent cx="5731510" cy="2363470"/>
@@ -1451,6 +1445,9 @@
         <w:pStyle w:val="Body"/>
       </w:pPr>
       <w:r>
+        <w:rPr>
+          <w:noProof/>
+        </w:rPr>
         <w:drawing>
           <wp:inline distT="0" distB="0" distL="0" distR="0" wp14:anchorId="63F81FE3" wp14:editId="0AFCB541">
             <wp:extent cx="5731510" cy="1301115"/>
@@ -1511,6 +1508,9 @@
         <w:pStyle w:val="Body"/>
       </w:pPr>
       <w:r>
+        <w:rPr>
+          <w:noProof/>
+        </w:rPr>
         <w:drawing>
           <wp:inline distT="0" distB="0" distL="0" distR="0" wp14:anchorId="5374BFAA" wp14:editId="4B42F9D2">
             <wp:extent cx="5731510" cy="2021840"/>
@@ -1572,10 +1572,201 @@
     <w:p>
       <w:pPr>
         <w:pStyle w:val="Body"/>
-        <w:rPr>
-          <w:lang w:val="uk-UA"/>
-        </w:rPr>
-      </w:pPr>
+      </w:pPr>
+    </w:p>
+    <w:p>
+      <w:pPr>
+        <w:pStyle w:val="Body"/>
+      </w:pPr>
+    </w:p>
+    <w:p>
+      <w:pPr>
+        <w:pStyle w:val="Body"/>
+      </w:pPr>
+    </w:p>
+    <w:p>
+      <w:pPr>
+        <w:pStyle w:val="Heading1"/>
+      </w:pPr>
+      <w:r>
+        <w:lastRenderedPageBreak/>
+        <w:t>Logic Analyzer connection</w:t>
+      </w:r>
+    </w:p>
+    <w:p>
+      <w:pPr>
+        <w:pStyle w:val="Body"/>
+      </w:pPr>
+    </w:p>
+    <w:p>
+      <w:pPr>
+        <w:pStyle w:val="Body"/>
+      </w:pPr>
+      <w:r>
+        <w:drawing>
+          <wp:inline distT="0" distB="0" distL="0" distR="0" wp14:anchorId="5781596A" wp14:editId="684080EE">
+            <wp:extent cx="5731510" cy="2886710"/>
+            <wp:effectExtent l="0" t="0" r="2540" b="8890"/>
+            <wp:docPr id="1714893793" name="Picture 1"/>
+            <wp:cNvGraphicFramePr>
+              <a:graphicFrameLocks xmlns:a="http://schemas.openxmlformats.org/drawingml/2006/main" noChangeAspect="1"/>
+            </wp:cNvGraphicFramePr>
+            <a:graphic xmlns:a="http://schemas.openxmlformats.org/drawingml/2006/main">
+              <a:graphicData uri="http://schemas.openxmlformats.org/drawingml/2006/picture">
+                <pic:pic xmlns:pic="http://schemas.openxmlformats.org/drawingml/2006/picture">
+                  <pic:nvPicPr>
+                    <pic:cNvPr id="1714893793" name=""/>
+                    <pic:cNvPicPr/>
+                  </pic:nvPicPr>
+                  <pic:blipFill>
+                    <a:blip r:embed="rId14"/>
+                    <a:stretch>
+                      <a:fillRect/>
+                    </a:stretch>
+                  </pic:blipFill>
+                  <pic:spPr>
+                    <a:xfrm>
+                      <a:off x="0" y="0"/>
+                      <a:ext cx="5731510" cy="2886710"/>
+                    </a:xfrm>
+                    <a:prstGeom prst="rect">
+                      <a:avLst/>
+                    </a:prstGeom>
+                  </pic:spPr>
+                </pic:pic>
+              </a:graphicData>
+            </a:graphic>
+          </wp:inline>
+        </w:drawing>
+      </w:r>
+    </w:p>
+    <w:p>
+      <w:pPr>
+        <w:pStyle w:val="Body"/>
+      </w:pPr>
+    </w:p>
+    <w:p>
+      <w:pPr>
+        <w:pStyle w:val="Body"/>
+      </w:pPr>
+      <w:r>
+        <w:drawing>
+          <wp:inline distT="0" distB="0" distL="0" distR="0" wp14:anchorId="6EE85A92" wp14:editId="23A4542F">
+            <wp:extent cx="5731510" cy="1760220"/>
+            <wp:effectExtent l="0" t="0" r="2540" b="0"/>
+            <wp:docPr id="240741524" name="Picture 1"/>
+            <wp:cNvGraphicFramePr>
+              <a:graphicFrameLocks xmlns:a="http://schemas.openxmlformats.org/drawingml/2006/main" noChangeAspect="1"/>
+            </wp:cNvGraphicFramePr>
+            <a:graphic xmlns:a="http://schemas.openxmlformats.org/drawingml/2006/main">
+              <a:graphicData uri="http://schemas.openxmlformats.org/drawingml/2006/picture">
+                <pic:pic xmlns:pic="http://schemas.openxmlformats.org/drawingml/2006/picture">
+                  <pic:nvPicPr>
+                    <pic:cNvPr id="240741524" name=""/>
+                    <pic:cNvPicPr/>
+                  </pic:nvPicPr>
+                  <pic:blipFill>
+                    <a:blip r:embed="rId15"/>
+                    <a:stretch>
+                      <a:fillRect/>
+                    </a:stretch>
+                  </pic:blipFill>
+                  <pic:spPr>
+                    <a:xfrm>
+                      <a:off x="0" y="0"/>
+                      <a:ext cx="5731510" cy="1760220"/>
+                    </a:xfrm>
+                    <a:prstGeom prst="rect">
+                      <a:avLst/>
+                    </a:prstGeom>
+                  </pic:spPr>
+                </pic:pic>
+              </a:graphicData>
+            </a:graphic>
+          </wp:inline>
+        </w:drawing>
+      </w:r>
+    </w:p>
+    <w:p>
+      <w:pPr>
+        <w:pStyle w:val="Body"/>
+      </w:pPr>
+    </w:p>
+    <w:p>
+      <w:pPr>
+        <w:pStyle w:val="Body"/>
+      </w:pPr>
+    </w:p>
+    <w:p>
+      <w:pPr>
+        <w:pStyle w:val="Body"/>
+      </w:pPr>
+    </w:p>
+    <w:p>
+      <w:pPr>
+        <w:pStyle w:val="Body"/>
+      </w:pPr>
+    </w:p>
+    <w:p>
+      <w:pPr>
+        <w:pStyle w:val="Body"/>
+      </w:pPr>
+    </w:p>
+    <w:p>
+      <w:pPr>
+        <w:pStyle w:val="Body"/>
+      </w:pPr>
+      <w:r>
+        <w:rPr>
+          <w:noProof/>
+        </w:rPr>
+        <w:lastRenderedPageBreak/>
+        <w:drawing>
+          <wp:inline distT="0" distB="0" distL="0" distR="0" wp14:anchorId="320BC074" wp14:editId="28EB38D7">
+            <wp:extent cx="4814653" cy="4579098"/>
+            <wp:effectExtent l="0" t="0" r="0" b="0"/>
+            <wp:docPr id="157768997" name="Picture 2"/>
+            <wp:cNvGraphicFramePr>
+              <a:graphicFrameLocks xmlns:a="http://schemas.openxmlformats.org/drawingml/2006/main" noChangeAspect="1"/>
+            </wp:cNvGraphicFramePr>
+            <a:graphic xmlns:a="http://schemas.openxmlformats.org/drawingml/2006/main">
+              <a:graphicData uri="http://schemas.openxmlformats.org/drawingml/2006/picture">
+                <pic:pic xmlns:pic="http://schemas.openxmlformats.org/drawingml/2006/picture">
+                  <pic:nvPicPr>
+                    <pic:cNvPr id="0" name="Picture 2"/>
+                    <pic:cNvPicPr>
+                      <a:picLocks noChangeAspect="1" noChangeArrowheads="1"/>
+                    </pic:cNvPicPr>
+                  </pic:nvPicPr>
+                  <pic:blipFill>
+                    <a:blip r:embed="rId16">
+                      <a:extLst>
+                        <a:ext uri="{28A0092B-C50C-407E-A947-70E740481C1C}">
+                          <a14:useLocalDpi xmlns:a14="http://schemas.microsoft.com/office/drawing/2010/main" val="0"/>
+                        </a:ext>
+                      </a:extLst>
+                    </a:blip>
+                    <a:srcRect/>
+                    <a:stretch>
+                      <a:fillRect/>
+                    </a:stretch>
+                  </pic:blipFill>
+                  <pic:spPr bwMode="auto">
+                    <a:xfrm>
+                      <a:off x="0" y="0"/>
+                      <a:ext cx="4823420" cy="4587436"/>
+                    </a:xfrm>
+                    <a:prstGeom prst="rect">
+                      <a:avLst/>
+                    </a:prstGeom>
+                    <a:noFill/>
+                  </pic:spPr>
+                </pic:pic>
+              </a:graphicData>
+            </a:graphic>
+          </wp:inline>
+        </w:drawing>
+      </w:r>
     </w:p>
     <w:p>
       <w:pPr>
@@ -7503,28 +7694,28 @@
 </file>
 
 <file path=customXml/item1.xml><?xml version="1.0" encoding="utf-8"?>
+<Sources xmlns:b="http://schemas.openxmlformats.org/officeDocument/2006/bibliography" xmlns="http://schemas.openxmlformats.org/officeDocument/2006/bibliography" SelectedStyle="\APASixthEditionOfficeOnline (1).xsl" StyleName="APA" Version="6"/>
+</file>
+
+<file path=customXml/item2.xml><?xml version="1.0" encoding="utf-8"?>
 <ElementMetadata xmlns="http://www.made-in-office.com/empower/docs/element/v1">
   <BinaryId>dfbe75ae-db68-459f-9acc-9a2651dcbb62</BinaryId>
   <ElementId>9b329c89-982a-4e83-badb-ff0ddffb9381</ElementId>
 </ElementMetadata>
 </file>
 
-<file path=customXml/item2.xml><?xml version="1.0" encoding="utf-8"?>
-<Sources xmlns:b="http://schemas.openxmlformats.org/officeDocument/2006/bibliography" xmlns="http://schemas.openxmlformats.org/officeDocument/2006/bibliography" SelectedStyle="\APASixthEditionOfficeOnline (1).xsl" StyleName="APA" Version="6"/>
-</file>
-
 <file path=customXml/itemProps1.xml><?xml version="1.0" encoding="utf-8"?>
-<ds:datastoreItem xmlns:ds="http://schemas.openxmlformats.org/officeDocument/2006/customXml" ds:itemID="{0FF08C31-8723-440F-BAB0-C3A78FB0B425}">
+<ds:datastoreItem xmlns:ds="http://schemas.openxmlformats.org/officeDocument/2006/customXml" ds:itemID="{1A80EA67-42E0-4C50-9559-F08C3118C72A}">
   <ds:schemaRefs>
-    <ds:schemaRef ds:uri="http://www.made-in-office.com/empower/docs/element/v1"/>
+    <ds:schemaRef ds:uri="http://schemas.openxmlformats.org/officeDocument/2006/bibliography"/>
   </ds:schemaRefs>
 </ds:datastoreItem>
 </file>
 
 <file path=customXml/itemProps2.xml><?xml version="1.0" encoding="utf-8"?>
-<ds:datastoreItem xmlns:ds="http://schemas.openxmlformats.org/officeDocument/2006/customXml" ds:itemID="{1A80EA67-42E0-4C50-9559-F08C3118C72A}">
+<ds:datastoreItem xmlns:ds="http://schemas.openxmlformats.org/officeDocument/2006/customXml" ds:itemID="{0FF08C31-8723-440F-BAB0-C3A78FB0B425}">
   <ds:schemaRefs>
-    <ds:schemaRef ds:uri="http://schemas.openxmlformats.org/officeDocument/2006/bibliography"/>
+    <ds:schemaRef ds:uri="http://www.made-in-office.com/empower/docs/element/v1"/>
   </ds:schemaRefs>
 </ds:datastoreItem>
 </file>

</xml_diff>